<commit_message>
Update CV working-rights statement for student visa (subclass 500)
Co-authored-by: Bhupraj Tamang <BhuprajTmg@users.noreply.github.com>
</commit_message>
<xml_diff>
--- a/CV_Bhupraj_Tamang_NV1_Security_Officer.docx
+++ b/CV_Bhupraj_Tamang_NV1_Security_Officer.docx
@@ -40,7 +40,7 @@
           <w:color w:val="333333"/>
           <w:sz w:val="19"/>
         </w:rPr>
-        <w:t>Full Australian Working Rights  |  Available for All Shifts (Day / Night / Weekend / 4-on 4-off Rotation)</w:t>
+        <w:t>Student Visa (Subclass 500) — Eligible to Work  |  Available for All Shifts (Day / Night / Weekend / 4-on 4-off Rotation)</w:t>
       </w:r>
     </w:p>
     <w:p>
@@ -81,6 +81,19 @@
     </w:p>
     <w:p>
       <w:pPr>
+        <w:spacing w:after="40"/>
+      </w:pPr>
+      <w:r>
+        <w:rPr>
+          <w:i/>
+          <w:color w:val="800000"/>
+          <w:sz w:val="19"/>
+        </w:rPr>
+        <w:t>Note: This role requires an active NV1 security clearance. [Insert your NV1 clearance status here.]</w:t>
+      </w:r>
+    </w:p>
+    <w:p>
+      <w:pPr>
         <w:spacing w:after="80"/>
       </w:pPr>
       <w:r>
@@ -89,7 +102,7 @@
           <w:color w:val="800000"/>
           <w:sz w:val="19"/>
         </w:rPr>
-        <w:t>Note: This role requires an active NV1 security clearance. [Insert your NV1 clearance status here.]</w:t>
+        <w:t>Visa condition: As a Student visa (Subclass 500) holder, work is limited to 48 hours per fortnight while my course is in session, and unlimited during scheduled study breaks, in accordance with visa condition 8105. Happy to discuss rostering around this during the interview.</w:t>
       </w:r>
     </w:p>
     <w:p>
@@ -855,7 +868,7 @@
           <w:color w:val="333333"/>
           <w:sz w:val="21"/>
         </w:rPr>
-        <w:t>Full Australian working rights</w:t>
+        <w:t>Student Visa (Subclass 500) — able to work up to 48 hours per fortnight during study sessions, and unlimited hours during scheduled study breaks</w:t>
       </w:r>
     </w:p>
     <w:p>

</xml_diff>